<commit_message>
Add AnA IQ Feature Highlights deck + architecture doc addendum
- New docs/Final docs/AYANA_AnA_IQ_Feature_Highlights.pptx: a
  presentation-ready deck summarizing every shipped feature, organized
  pillar-by-pillar (Traveller App, Kiosk, Control Centre, Hotel Ops
  Dashboard), with AnA IQ positioned as the flagship feature. Built to
  the AYANA brand palette/typography, validated and visually QA'd.
- docs/AYANA_Intent_Engine_Architecture.docx: appended an addendum
  explaining how AnA IQ is the productized identity built on top of
  this architecture, what was added since the doc was written, and
  where to find the current authoritative feature list.
- Includes the user's own edits to AYANA_Intro_Objection_Handling.pptx.

Co-Authored-By: Claude Sonnet 5 <noreply@anthropic.com>
</commit_message>
<xml_diff>
--- a/docs/AYANA_Intent_Engine_Architecture.docx
+++ b/docs/AYANA_Intent_Engine_Architecture.docx
@@ -10144,546 +10144,315 @@
           <w:szCs w:val="16"/>
         </w:rPr>
         <w:t xml:space="preserve">CREATE TABLE intent_template (</w:t>
-      </w:r>
-      <w:r>
-        <w:rPr>
-          <w:rFonts w:ascii="Courier New" w:cs="Courier New" w:eastAsia="Courier New" w:hAnsi="Courier New"/>
-          <w:color w:val="1A1A1A"/>
-          <w:sz w:val="16"/>
-          <w:szCs w:val="16"/>
-        </w:rPr>
         <w:br/>
         <w:t xml:space="preserve">  id            UUID PRIMARY KEY,</w:t>
-      </w:r>
-      <w:r>
-        <w:rPr>
-          <w:rFonts w:ascii="Courier New" w:cs="Courier New" w:eastAsia="Courier New" w:hAnsi="Courier New"/>
-          <w:color w:val="1A1A1A"/>
-          <w:sz w:val="16"/>
-          <w:szCs w:val="16"/>
-        </w:rPr>
         <w:br/>
         <w:t xml:space="preserve">  label         TEXT NOT NULL,</w:t>
-      </w:r>
-      <w:r>
-        <w:rPr>
-          <w:rFonts w:ascii="Courier New" w:cs="Courier New" w:eastAsia="Courier New" w:hAnsi="Courier New"/>
-          <w:color w:val="1A1A1A"/>
-          <w:sz w:val="16"/>
-          <w:szCs w:val="16"/>
-        </w:rPr>
         <w:br/>
         <w:t xml:space="preserve">  category      TEXT NOT NULL,</w:t>
-      </w:r>
-      <w:r>
-        <w:rPr>
-          <w:rFonts w:ascii="Courier New" w:cs="Courier New" w:eastAsia="Courier New" w:hAnsi="Courier New"/>
-          <w:color w:val="1A1A1A"/>
-          <w:sz w:val="16"/>
-          <w:szCs w:val="16"/>
-        </w:rPr>
         <w:br/>
         <w:t xml:space="preserve">  deep_built    BOOLEAN NOT NULL DEFAULT FALSE,</w:t>
-      </w:r>
-      <w:r>
-        <w:rPr>
-          <w:rFonts w:ascii="Courier New" w:cs="Courier New" w:eastAsia="Courier New" w:hAnsi="Courier New"/>
-          <w:color w:val="1A1A1A"/>
-          <w:sz w:val="16"/>
-          <w:szCs w:val="16"/>
-        </w:rPr>
         <w:br/>
         <w:t xml:space="preserve">  brand_id      UUID NULL REFERENCES brand(id),</w:t>
-      </w:r>
-      <w:r>
-        <w:rPr>
-          <w:rFonts w:ascii="Courier New" w:cs="Courier New" w:eastAsia="Courier New" w:hAnsi="Courier New"/>
-          <w:color w:val="1A1A1A"/>
-          <w:sz w:val="16"/>
-          <w:szCs w:val="16"/>
-        </w:rPr>
         <w:br/>
         <w:t xml:space="preserve">  property_id   UUID NULL REFERENCES property(id),</w:t>
-      </w:r>
-      <w:r>
-        <w:rPr>
-          <w:rFonts w:ascii="Courier New" w:cs="Courier New" w:eastAsia="Courier New" w:hAnsi="Courier New"/>
-          <w:color w:val="1A1A1A"/>
-          <w:sz w:val="16"/>
-          <w:szCs w:val="16"/>
-        </w:rPr>
         <w:br/>
         <w:t xml:space="preserve">  version       INT NOT NULL DEFAULT 1</w:t>
-      </w:r>
-      <w:r>
-        <w:rPr>
-          <w:rFonts w:ascii="Courier New" w:cs="Courier New" w:eastAsia="Courier New" w:hAnsi="Courier New"/>
-          <w:color w:val="1A1A1A"/>
-          <w:sz w:val="16"/>
-          <w:szCs w:val="16"/>
-        </w:rPr>
         <w:br/>
         <w:t xml:space="preserve">);</w:t>
-      </w:r>
-      <w:r>
-        <w:rPr>
-          <w:rFonts w:ascii="Courier New" w:cs="Courier New" w:eastAsia="Courier New" w:hAnsi="Courier New"/>
-          <w:color w:val="1A1A1A"/>
-          <w:sz w:val="16"/>
-          <w:szCs w:val="16"/>
-        </w:rPr>
         <w:br/>
         <w:t xml:space="preserve"/>
-      </w:r>
-      <w:r>
-        <w:rPr>
-          <w:rFonts w:ascii="Courier New" w:cs="Courier New" w:eastAsia="Courier New" w:hAnsi="Courier New"/>
-          <w:color w:val="1A1A1A"/>
-          <w:sz w:val="16"/>
-          <w:szCs w:val="16"/>
-        </w:rPr>
         <w:br/>
         <w:t xml:space="preserve">CREATE TABLE reservation_intent (</w:t>
-      </w:r>
-      <w:r>
-        <w:rPr>
-          <w:rFonts w:ascii="Courier New" w:cs="Courier New" w:eastAsia="Courier New" w:hAnsi="Courier New"/>
-          <w:color w:val="1A1A1A"/>
-          <w:sz w:val="16"/>
-          <w:szCs w:val="16"/>
-        </w:rPr>
         <w:br/>
         <w:t xml:space="preserve">  id                UUID PRIMARY KEY,</w:t>
-      </w:r>
-      <w:r>
-        <w:rPr>
-          <w:rFonts w:ascii="Courier New" w:cs="Courier New" w:eastAsia="Courier New" w:hAnsi="Courier New"/>
-          <w:color w:val="1A1A1A"/>
-          <w:sz w:val="16"/>
-          <w:szCs w:val="16"/>
-        </w:rPr>
         <w:br/>
         <w:t xml:space="preserve">  reservation_id    UUID NOT NULL REFERENCES reservation(id),</w:t>
-      </w:r>
-      <w:r>
-        <w:rPr>
-          <w:rFonts w:ascii="Courier New" w:cs="Courier New" w:eastAsia="Courier New" w:hAnsi="Courier New"/>
-          <w:color w:val="1A1A1A"/>
-          <w:sz w:val="16"/>
-          <w:szCs w:val="16"/>
-        </w:rPr>
         <w:br/>
         <w:t xml:space="preserve">  intent_template_id UUID NOT NULL REFERENCES intent_template(id),</w:t>
-      </w:r>
-      <w:r>
-        <w:rPr>
-          <w:rFonts w:ascii="Courier New" w:cs="Courier New" w:eastAsia="Courier New" w:hAnsi="Courier New"/>
-          <w:color w:val="1A1A1A"/>
-          <w:sz w:val="16"/>
-          <w:szCs w:val="16"/>
-        </w:rPr>
         <w:br/>
         <w:t xml:space="preserve">  role              TEXT NOT NULL CHECK (role IN ('primary','secondary','supporting')),</w:t>
-      </w:r>
-      <w:r>
-        <w:rPr>
-          <w:rFonts w:ascii="Courier New" w:cs="Courier New" w:eastAsia="Courier New" w:hAnsi="Courier New"/>
-          <w:color w:val="1A1A1A"/>
-          <w:sz w:val="16"/>
-          <w:szCs w:val="16"/>
-        </w:rPr>
         <w:br/>
         <w:t xml:space="preserve">  weight_percent    INT NOT NULL,</w:t>
-      </w:r>
-      <w:r>
-        <w:rPr>
-          <w:rFonts w:ascii="Courier New" w:cs="Courier New" w:eastAsia="Courier New" w:hAnsi="Courier New"/>
-          <w:color w:val="1A1A1A"/>
-          <w:sz w:val="16"/>
-          <w:szCs w:val="16"/>
-        </w:rPr>
         <w:br/>
         <w:t xml:space="preserve">  status            TEXT NOT NULL DEFAULT 'active',</w:t>
-      </w:r>
-      <w:r>
-        <w:rPr>
-          <w:rFonts w:ascii="Courier New" w:cs="Courier New" w:eastAsia="Courier New" w:hAnsi="Courier New"/>
-          <w:color w:val="1A1A1A"/>
-          <w:sz w:val="16"/>
-          <w:szCs w:val="16"/>
-        </w:rPr>
         <w:br/>
         <w:t xml:space="preserve">  created_at        TIMESTAMPTZ NOT NULL DEFAULT now()</w:t>
-      </w:r>
-      <w:r>
-        <w:rPr>
-          <w:rFonts w:ascii="Courier New" w:cs="Courier New" w:eastAsia="Courier New" w:hAnsi="Courier New"/>
-          <w:color w:val="1A1A1A"/>
-          <w:sz w:val="16"/>
-          <w:szCs w:val="16"/>
-        </w:rPr>
         <w:br/>
         <w:t xml:space="preserve">);</w:t>
-      </w:r>
-      <w:r>
-        <w:rPr>
-          <w:rFonts w:ascii="Courier New" w:cs="Courier New" w:eastAsia="Courier New" w:hAnsi="Courier New"/>
-          <w:color w:val="1A1A1A"/>
-          <w:sz w:val="16"/>
-          <w:szCs w:val="16"/>
-        </w:rPr>
         <w:br/>
         <w:t xml:space="preserve"/>
-      </w:r>
-      <w:r>
-        <w:rPr>
-          <w:rFonts w:ascii="Courier New" w:cs="Courier New" w:eastAsia="Courier New" w:hAnsi="Courier New"/>
-          <w:color w:val="1A1A1A"/>
-          <w:sz w:val="16"/>
-          <w:szCs w:val="16"/>
-        </w:rPr>
         <w:br/>
         <w:t xml:space="preserve">CREATE TABLE experience_blueprint (</w:t>
-      </w:r>
-      <w:r>
-        <w:rPr>
-          <w:rFonts w:ascii="Courier New" w:cs="Courier New" w:eastAsia="Courier New" w:hAnsi="Courier New"/>
-          <w:color w:val="1A1A1A"/>
-          <w:sz w:val="16"/>
-          <w:szCs w:val="16"/>
-        </w:rPr>
         <w:br/>
         <w:t xml:space="preserve">  id                    UUID PRIMARY KEY,</w:t>
-      </w:r>
-      <w:r>
-        <w:rPr>
-          <w:rFonts w:ascii="Courier New" w:cs="Courier New" w:eastAsia="Courier New" w:hAnsi="Courier New"/>
-          <w:color w:val="1A1A1A"/>
-          <w:sz w:val="16"/>
-          <w:szCs w:val="16"/>
-        </w:rPr>
         <w:br/>
         <w:t xml:space="preserve">  reservation_intent_id UUID NOT NULL REFERENCES reservation_intent(id),</w:t>
-      </w:r>
-      <w:r>
-        <w:rPr>
-          <w:rFonts w:ascii="Courier New" w:cs="Courier New" w:eastAsia="Courier New" w:hAnsi="Courier New"/>
-          <w:color w:val="1A1A1A"/>
-          <w:sz w:val="16"/>
-          <w:szCs w:val="16"/>
-        </w:rPr>
         <w:br/>
         <w:t xml:space="preserve">  generated_at          TIMESTAMPTZ NOT NULL DEFAULT now()</w:t>
-      </w:r>
-      <w:r>
-        <w:rPr>
-          <w:rFonts w:ascii="Courier New" w:cs="Courier New" w:eastAsia="Courier New" w:hAnsi="Courier New"/>
-          <w:color w:val="1A1A1A"/>
-          <w:sz w:val="16"/>
-          <w:szCs w:val="16"/>
-        </w:rPr>
         <w:br/>
         <w:t xml:space="preserve">);</w:t>
-      </w:r>
-      <w:r>
-        <w:rPr>
-          <w:rFonts w:ascii="Courier New" w:cs="Courier New" w:eastAsia="Courier New" w:hAnsi="Courier New"/>
-          <w:color w:val="1A1A1A"/>
-          <w:sz w:val="16"/>
-          <w:szCs w:val="16"/>
-        </w:rPr>
         <w:br/>
         <w:t xml:space="preserve"/>
-      </w:r>
-      <w:r>
-        <w:rPr>
-          <w:rFonts w:ascii="Courier New" w:cs="Courier New" w:eastAsia="Courier New" w:hAnsi="Courier New"/>
-          <w:color w:val="1A1A1A"/>
-          <w:sz w:val="16"/>
-          <w:szCs w:val="16"/>
-        </w:rPr>
         <w:br/>
         <w:t xml:space="preserve">CREATE TABLE blueprint_item (</w:t>
-      </w:r>
-      <w:r>
-        <w:rPr>
-          <w:rFonts w:ascii="Courier New" w:cs="Courier New" w:eastAsia="Courier New" w:hAnsi="Courier New"/>
-          <w:color w:val="1A1A1A"/>
-          <w:sz w:val="16"/>
-          <w:szCs w:val="16"/>
-        </w:rPr>
         <w:br/>
         <w:t xml:space="preserve">  id            UUID PRIMARY KEY,</w:t>
-      </w:r>
-      <w:r>
-        <w:rPr>
-          <w:rFonts w:ascii="Courier New" w:cs="Courier New" w:eastAsia="Courier New" w:hAnsi="Courier New"/>
-          <w:color w:val="1A1A1A"/>
-          <w:sz w:val="16"/>
-          <w:szCs w:val="16"/>
-        </w:rPr>
         <w:br/>
         <w:t xml:space="preserve">  blueprint_id  UUID NOT NULL REFERENCES experience_blueprint(id),</w:t>
-      </w:r>
-      <w:r>
-        <w:rPr>
-          <w:rFonts w:ascii="Courier New" w:cs="Courier New" w:eastAsia="Courier New" w:hAnsi="Courier New"/>
-          <w:color w:val="1A1A1A"/>
-          <w:sz w:val="16"/>
-          <w:szCs w:val="16"/>
-        </w:rPr>
         <w:br/>
         <w:t xml:space="preserve">  label         TEXT NOT NULL,</w:t>
-      </w:r>
-      <w:r>
-        <w:rPr>
-          <w:rFonts w:ascii="Courier New" w:cs="Courier New" w:eastAsia="Courier New" w:hAnsi="Courier New"/>
-          <w:color w:val="1A1A1A"/>
-          <w:sz w:val="16"/>
-          <w:szCs w:val="16"/>
-        </w:rPr>
         <w:br/>
         <w:t xml:space="preserve">  kind          TEXT NOT NULL CHECK (kind IN ('auto_ready','concierge_request','department_task')),</w:t>
-      </w:r>
-      <w:r>
-        <w:rPr>
-          <w:rFonts w:ascii="Courier New" w:cs="Courier New" w:eastAsia="Courier New" w:hAnsi="Courier New"/>
-          <w:color w:val="1A1A1A"/>
-          <w:sz w:val="16"/>
-          <w:szCs w:val="16"/>
-        </w:rPr>
         <w:br/>
         <w:t xml:space="preserve">  done          BOOLEAN NOT NULL DEFAULT FALSE</w:t>
-      </w:r>
-      <w:r>
-        <w:rPr>
-          <w:rFonts w:ascii="Courier New" w:cs="Courier New" w:eastAsia="Courier New" w:hAnsi="Courier New"/>
-          <w:color w:val="1A1A1A"/>
-          <w:sz w:val="16"/>
-          <w:szCs w:val="16"/>
-        </w:rPr>
         <w:br/>
         <w:t xml:space="preserve">);</w:t>
-      </w:r>
-      <w:r>
-        <w:rPr>
-          <w:rFonts w:ascii="Courier New" w:cs="Courier New" w:eastAsia="Courier New" w:hAnsi="Courier New"/>
-          <w:color w:val="1A1A1A"/>
-          <w:sz w:val="16"/>
-          <w:szCs w:val="16"/>
-        </w:rPr>
         <w:br/>
         <w:t xml:space="preserve"/>
-      </w:r>
-      <w:r>
-        <w:rPr>
-          <w:rFonts w:ascii="Courier New" w:cs="Courier New" w:eastAsia="Courier New" w:hAnsi="Courier New"/>
-          <w:color w:val="1A1A1A"/>
-          <w:sz w:val="16"/>
-          <w:szCs w:val="16"/>
-        </w:rPr>
         <w:br/>
         <w:t xml:space="preserve">CREATE TABLE department_task (</w:t>
-      </w:r>
-      <w:r>
-        <w:rPr>
-          <w:rFonts w:ascii="Courier New" w:cs="Courier New" w:eastAsia="Courier New" w:hAnsi="Courier New"/>
-          <w:color w:val="1A1A1A"/>
-          <w:sz w:val="16"/>
-          <w:szCs w:val="16"/>
-        </w:rPr>
         <w:br/>
         <w:t xml:space="preserve">  id                UUID PRIMARY KEY,</w:t>
-      </w:r>
-      <w:r>
-        <w:rPr>
-          <w:rFonts w:ascii="Courier New" w:cs="Courier New" w:eastAsia="Courier New" w:hAnsi="Courier New"/>
-          <w:color w:val="1A1A1A"/>
-          <w:sz w:val="16"/>
-          <w:szCs w:val="16"/>
-        </w:rPr>
         <w:br/>
         <w:t xml:space="preserve">  blueprint_item_id UUID NOT NULL REFERENCES blueprint_item(id),</w:t>
-      </w:r>
-      <w:r>
-        <w:rPr>
-          <w:rFonts w:ascii="Courier New" w:cs="Courier New" w:eastAsia="Courier New" w:hAnsi="Courier New"/>
-          <w:color w:val="1A1A1A"/>
-          <w:sz w:val="16"/>
-          <w:szCs w:val="16"/>
-        </w:rPr>
         <w:br/>
         <w:t xml:space="preserve">  department        TEXT NOT NULL,</w:t>
-      </w:r>
-      <w:r>
-        <w:rPr>
-          <w:rFonts w:ascii="Courier New" w:cs="Courier New" w:eastAsia="Courier New" w:hAnsi="Courier New"/>
-          <w:color w:val="1A1A1A"/>
-          <w:sz w:val="16"/>
-          <w:szCs w:val="16"/>
-        </w:rPr>
         <w:br/>
         <w:t xml:space="preserve">  assigned_staff_id UUID NULL REFERENCES staff(id),</w:t>
-      </w:r>
-      <w:r>
-        <w:rPr>
-          <w:rFonts w:ascii="Courier New" w:cs="Courier New" w:eastAsia="Courier New" w:hAnsi="Courier New"/>
-          <w:color w:val="1A1A1A"/>
-          <w:sz w:val="16"/>
-          <w:szCs w:val="16"/>
-        </w:rPr>
         <w:br/>
         <w:t xml:space="preserve">  status            TEXT NOT NULL DEFAULT 'pending'</w:t>
-      </w:r>
-      <w:r>
-        <w:rPr>
-          <w:rFonts w:ascii="Courier New" w:cs="Courier New" w:eastAsia="Courier New" w:hAnsi="Courier New"/>
-          <w:color w:val="1A1A1A"/>
-          <w:sz w:val="16"/>
-          <w:szCs w:val="16"/>
-        </w:rPr>
         <w:br/>
         <w:t xml:space="preserve">);</w:t>
-      </w:r>
-      <w:r>
-        <w:rPr>
-          <w:rFonts w:ascii="Courier New" w:cs="Courier New" w:eastAsia="Courier New" w:hAnsi="Courier New"/>
-          <w:color w:val="1A1A1A"/>
-          <w:sz w:val="16"/>
-          <w:szCs w:val="16"/>
-        </w:rPr>
         <w:br/>
         <w:t xml:space="preserve"/>
-      </w:r>
-      <w:r>
-        <w:rPr>
-          <w:rFonts w:ascii="Courier New" w:cs="Courier New" w:eastAsia="Courier New" w:hAnsi="Courier New"/>
-          <w:color w:val="1A1A1A"/>
-          <w:sz w:val="16"/>
-          <w:szCs w:val="16"/>
-        </w:rPr>
         <w:br/>
         <w:t xml:space="preserve">CREATE TABLE journey_goal (</w:t>
-      </w:r>
-      <w:r>
-        <w:rPr>
-          <w:rFonts w:ascii="Courier New" w:cs="Courier New" w:eastAsia="Courier New" w:hAnsi="Courier New"/>
-          <w:color w:val="1A1A1A"/>
-          <w:sz w:val="16"/>
-          <w:szCs w:val="16"/>
-        </w:rPr>
         <w:br/>
         <w:t xml:space="preserve">  id              UUID PRIMARY KEY,</w:t>
-      </w:r>
-      <w:r>
-        <w:rPr>
-          <w:rFonts w:ascii="Courier New" w:cs="Courier New" w:eastAsia="Courier New" w:hAnsi="Courier New"/>
-          <w:color w:val="1A1A1A"/>
-          <w:sz w:val="16"/>
-          <w:szCs w:val="16"/>
-        </w:rPr>
         <w:br/>
         <w:t xml:space="preserve">  reservation_id  UUID NOT NULL REFERENCES reservation(id),</w:t>
-      </w:r>
-      <w:r>
-        <w:rPr>
-          <w:rFonts w:ascii="Courier New" w:cs="Courier New" w:eastAsia="Courier New" w:hAnsi="Courier New"/>
-          <w:color w:val="1A1A1A"/>
-          <w:sz w:val="16"/>
-          <w:szCs w:val="16"/>
-        </w:rPr>
         <w:br/>
         <w:t xml:space="preserve">  free_text       TEXT NOT NULL,</w:t>
-      </w:r>
-      <w:r>
-        <w:rPr>
-          <w:rFonts w:ascii="Courier New" w:cs="Courier New" w:eastAsia="Courier New" w:hAnsi="Courier New"/>
-          <w:color w:val="1A1A1A"/>
-          <w:sz w:val="16"/>
-          <w:szCs w:val="16"/>
-        </w:rPr>
         <w:br/>
         <w:t xml:space="preserve">  captured_at     TIMESTAMPTZ NOT NULL DEFAULT now()</w:t>
-      </w:r>
-      <w:r>
-        <w:rPr>
-          <w:rFonts w:ascii="Courier New" w:cs="Courier New" w:eastAsia="Courier New" w:hAnsi="Courier New"/>
-          <w:color w:val="1A1A1A"/>
-          <w:sz w:val="16"/>
-          <w:szCs w:val="16"/>
-        </w:rPr>
         <w:br/>
         <w:t xml:space="preserve">);</w:t>
-      </w:r>
-      <w:r>
-        <w:rPr>
-          <w:rFonts w:ascii="Courier New" w:cs="Courier New" w:eastAsia="Courier New" w:hAnsi="Courier New"/>
-          <w:color w:val="1A1A1A"/>
-          <w:sz w:val="16"/>
-          <w:szCs w:val="16"/>
-        </w:rPr>
         <w:br/>
         <w:t xml:space="preserve"/>
-      </w:r>
-      <w:r>
-        <w:rPr>
-          <w:rFonts w:ascii="Courier New" w:cs="Courier New" w:eastAsia="Courier New" w:hAnsi="Courier New"/>
-          <w:color w:val="1A1A1A"/>
-          <w:sz w:val="16"/>
-          <w:szCs w:val="16"/>
-        </w:rPr>
         <w:br/>
         <w:t xml:space="preserve">CREATE TABLE intent_fulfilment_score (</w:t>
-      </w:r>
-      <w:r>
-        <w:rPr>
-          <w:rFonts w:ascii="Courier New" w:cs="Courier New" w:eastAsia="Courier New" w:hAnsi="Courier New"/>
-          <w:color w:val="1A1A1A"/>
-          <w:sz w:val="16"/>
-          <w:szCs w:val="16"/>
-        </w:rPr>
         <w:br/>
         <w:t xml:space="preserve">  id                    UUID PRIMARY KEY,</w:t>
-      </w:r>
-      <w:r>
-        <w:rPr>
-          <w:rFonts w:ascii="Courier New" w:cs="Courier New" w:eastAsia="Courier New" w:hAnsi="Courier New"/>
-          <w:color w:val="1A1A1A"/>
-          <w:sz w:val="16"/>
-          <w:szCs w:val="16"/>
-        </w:rPr>
         <w:br/>
         <w:t xml:space="preserve">  reservation_intent_id UUID NOT NULL REFERENCES reservation_intent(id),</w:t>
-      </w:r>
-      <w:r>
-        <w:rPr>
-          <w:rFonts w:ascii="Courier New" w:cs="Courier New" w:eastAsia="Courier New" w:hAnsi="Courier New"/>
-          <w:color w:val="1A1A1A"/>
-          <w:sz w:val="16"/>
-          <w:szCs w:val="16"/>
-        </w:rPr>
         <w:br/>
         <w:t xml:space="preserve">  percent               INT NOT NULL,</w:t>
-      </w:r>
-      <w:r>
-        <w:rPr>
-          <w:rFonts w:ascii="Courier New" w:cs="Courier New" w:eastAsia="Courier New" w:hAnsi="Courier New"/>
-          <w:color w:val="1A1A1A"/>
-          <w:sz w:val="16"/>
-          <w:szCs w:val="16"/>
-        </w:rPr>
         <w:br/>
         <w:t xml:space="preserve">  computed_at           TIMESTAMPTZ NOT NULL DEFAULT now()</w:t>
-      </w:r>
-      <w:r>
-        <w:rPr>
-          <w:rFonts w:ascii="Courier New" w:cs="Courier New" w:eastAsia="Courier New" w:hAnsi="Courier New"/>
-          <w:color w:val="1A1A1A"/>
-          <w:sz w:val="16"/>
-          <w:szCs w:val="16"/>
-        </w:rPr>
         <w:br/>
         <w:t xml:space="preserve">);</w:t>
+      </w:r>
+    </w:p>
+    <w:p>
+      <w:pPr>
+        <w:pStyle w:val="Heading1"/>
+        <w:spacing w:after="200" w:before="480"/>
+      </w:pPr>
+      <w:r>
+        <w:rPr>
+          <w:b/>
+          <w:bCs/>
+          <w:color w:val="0A0F1C"/>
+        </w:rPr>
+        <w:t xml:space="preserve">Addendum — AnA IQ: The Productized Identity</w:t>
+      </w:r>
+    </w:p>
+    <w:p>
+      <w:pPr>
+        <w:spacing w:after="160" w:line="300"/>
+      </w:pPr>
+      <w:r>
+        <w:rPr>
+          <w:b w:val="false"/>
+          <w:bCs w:val="false"/>
+          <w:i w:val="false"/>
+          <w:iCs w:val="false"/>
+          <w:color w:val="1A1A1A"/>
+          <w:sz w:val="22"/>
+          <w:szCs w:val="22"/>
+        </w:rPr>
+        <w:t xml:space="preserve">This document defines the Intent Engine as backend architecture — matching, orchestration, and a fulfilment score computed but never shown to the guest. That principle has since been carried into a named, shipped identity across the working prototype: “AnA IQ.”</w:t>
+      </w:r>
+    </w:p>
+    <w:p>
+      <w:pPr>
+        <w:spacing w:after="160" w:line="300"/>
+      </w:pPr>
+      <w:r>
+        <w:rPr>
+          <w:b w:val="false"/>
+          <w:bCs w:val="false"/>
+          <w:i w:val="false"/>
+          <w:iCs w:val="false"/>
+          <w:color w:val="1A1A1A"/>
+          <w:sz w:val="22"/>
+          <w:szCs w:val="22"/>
+        </w:rPr>
+        <w:t xml:space="preserve">AnA IQ is explicitly not a physical robot. It is a virtual AI presence that amplifies AYANA’s own staff rather than replacing them — every action it takes still routes back to a named team member. It is invisible by default, explainable on demand, and never renders a score or checklist to the guest, extending this document’s architecture rather than departing from it.</w:t>
+      </w:r>
+    </w:p>
+    <w:p>
+      <w:pPr>
+        <w:pStyle w:val="Heading2"/>
+        <w:spacing w:after="160" w:before="320"/>
+      </w:pPr>
+      <w:r>
+        <w:rPr>
+          <w:b/>
+          <w:bCs/>
+          <w:color w:val="0A0F1C"/>
+        </w:rPr>
+        <w:t xml:space="preserve">What Was Added On Top Of This Architecture</w:t>
+      </w:r>
+    </w:p>
+    <w:p>
+      <w:pPr>
+        <w:pStyle w:val="ListParagraph"/>
+        <w:numPr>
+          <w:ilvl w:val="0"/>
+          <w:numId w:val="2"/>
+        </w:numPr>
+        <w:spacing w:after="90" w:line="280"/>
+      </w:pPr>
+      <w:r>
+        <w:rPr>
+          <w:color w:val="1A1A1A"/>
+          <w:sz w:val="22"/>
+          <w:szCs w:val="22"/>
+        </w:rPr>
+        <w:t xml:space="preserve">One consistent identity mark, used across every AI touchpoint in the App, Kiosk, Control Centre and Hotel Ops Dashboard — not a separate chatbot per screen.</w:t>
+      </w:r>
+    </w:p>
+    <w:p>
+      <w:pPr>
+        <w:pStyle w:val="ListParagraph"/>
+        <w:numPr>
+          <w:ilvl w:val="0"/>
+          <w:numId w:val="2"/>
+        </w:numPr>
+        <w:spacing w:after="90" w:line="280"/>
+      </w:pPr>
+      <w:r>
+        <w:rPr>
+          <w:color w:val="1A1A1A"/>
+          <w:sz w:val="22"/>
+          <w:szCs w:val="22"/>
+        </w:rPr>
+        <w:t xml:space="preserve">Proactive, one-tap suggestions during the stay (e.g. a wake-up call offered ahead of checkout), always guest-initiated on accept and staff-attributed on fulfilment.</w:t>
+      </w:r>
+    </w:p>
+    <w:p>
+      <w:pPr>
+        <w:pStyle w:val="ListParagraph"/>
+        <w:numPr>
+          <w:ilvl w:val="0"/>
+          <w:numId w:val="2"/>
+        </w:numPr>
+        <w:spacing w:after="90" w:line="280"/>
+      </w:pPr>
+      <w:r>
+        <w:rPr>
+          <w:color w:val="1A1A1A"/>
+          <w:sz w:val="22"/>
+          <w:szCs w:val="22"/>
+        </w:rPr>
+        <w:t xml:space="preserve">Returning-guest recall at the moment of booking, surfacing real AYANA Memory preferences before the guest has to restate them.</w:t>
+      </w:r>
+    </w:p>
+    <w:p>
+      <w:pPr>
+        <w:pStyle w:val="ListParagraph"/>
+        <w:numPr>
+          <w:ilvl w:val="0"/>
+          <w:numId w:val="2"/>
+        </w:numPr>
+        <w:spacing w:after="90" w:line="280"/>
+      </w:pPr>
+      <w:r>
+        <w:rPr>
+          <w:color w:val="1A1A1A"/>
+          <w:sz w:val="22"/>
+          <w:szCs w:val="22"/>
+        </w:rPr>
+        <w:t xml:space="preserve">A plain-language, pre-arrival “Readiness Brief” and an in-stay “Arranged For Your Trip” list — finished items only, never a percentage or an open checklist.</w:t>
+      </w:r>
+    </w:p>
+    <w:p>
+      <w:pPr>
+        <w:pStyle w:val="ListParagraph"/>
+        <w:numPr>
+          <w:ilvl w:val="0"/>
+          <w:numId w:val="2"/>
+        </w:numPr>
+        <w:spacing w:after="90" w:line="280"/>
+      </w:pPr>
+      <w:r>
+        <w:rPr>
+          <w:color w:val="1A1A1A"/>
+          <w:sz w:val="22"/>
+          <w:szCs w:val="22"/>
+        </w:rPr>
+        <w:t xml:space="preserve">Simulated Weather Intelligence and Room Controls, Celebration Manager, Experience Planner, Document Vault and Expense Tracker, and rule-based “Learn My Preferences.”</w:t>
+      </w:r>
+    </w:p>
+    <w:p>
+      <w:pPr>
+        <w:pStyle w:val="ListParagraph"/>
+        <w:numPr>
+          <w:ilvl w:val="0"/>
+          <w:numId w:val="2"/>
+        </w:numPr>
+        <w:spacing w:after="90" w:line="280"/>
+      </w:pPr>
+      <w:r>
+        <w:rPr>
+          <w:color w:val="1A1A1A"/>
+          <w:sz w:val="22"/>
+          <w:szCs w:val="22"/>
+        </w:rPr>
+        <w:t xml:space="preserve">A living AnA IQ Feature Guide inside the Simulation Control Centre, separating what is shipped from what remains proposed.</w:t>
+      </w:r>
+    </w:p>
+    <w:p>
+      <w:pPr>
+        <w:pStyle w:val="Heading2"/>
+        <w:spacing w:after="160" w:before="320"/>
+      </w:pPr>
+      <w:r>
+        <w:rPr>
+          <w:b/>
+          <w:bCs/>
+          <w:color w:val="0A0F1C"/>
+        </w:rPr>
+        <w:t xml:space="preserve">Where To See The Current Feature Set</w:t>
+      </w:r>
+    </w:p>
+    <w:p>
+      <w:pPr>
+        <w:spacing w:after="160" w:line="300"/>
+      </w:pPr>
+      <w:r>
+        <w:rPr>
+          <w:b w:val="false"/>
+          <w:bCs w:val="false"/>
+          <w:i/>
+          <w:iCs/>
+          <w:color w:val="1A1A1A"/>
+          <w:sz w:val="22"/>
+          <w:szCs w:val="22"/>
+        </w:rPr>
+        <w:t xml:space="preserve">This architecture document reflects the system design at the time it was written. For the authoritative, current list of what is actually shipped, refer to the AnA IQ Feature Guide inside the Simulation Control Centre (live in the running prototype) and the companion deck AYANA_AnA_IQ_Feature_Highlights.pptx in this same folder — both are pillar-by-pillar and kept in step with the codebase.</w:t>
       </w:r>
     </w:p>
     <w:sectPr>

</xml_diff>